<commit_message>
Update student worksheet document
</commit_message>
<xml_diff>
--- a/materials/SeatGate_Student_Worksheet_Updated.docx
+++ b/materials/SeatGate_Student_Worksheet_Updated.docx
@@ -27,24 +27,42 @@
     <w:p>
       <w:pPr>
         <w:spacing w:after="80" w:line="240" w:lineRule="auto"/>
+        <w:rPr>
+          <w:sz w:val="22"/>
+        </w:rPr>
       </w:pPr>
       <w:r>
+        <w:rPr>
+          <w:sz w:val="22"/>
+        </w:rPr>
         <w:t>This case must be completed only within the sandboxed classroom website provided by the instructor. Students must not use automation techniques on real ticketing websites, commercial platforms, or any system that they do not own or do not have explicit written permission to test.</w:t>
       </w:r>
     </w:p>
     <w:p>
       <w:pPr>
         <w:spacing w:after="80" w:line="240" w:lineRule="auto"/>
+        <w:rPr>
+          <w:sz w:val="22"/>
+        </w:rPr>
       </w:pPr>
       <w:r>
+        <w:rPr>
+          <w:sz w:val="22"/>
+        </w:rPr>
         <w:t>Unauthorized automation, circumvention of access controls, credential misuse, scraping, or interference with commercial systems may violate website terms of service and applicable civil or criminal laws, including the Computer Fraud and Abuse Act and, in the ticketing context, the BOTS Act.</w:t>
       </w:r>
     </w:p>
     <w:p>
       <w:pPr>
         <w:spacing w:after="80" w:line="240" w:lineRule="auto"/>
+        <w:rPr>
+          <w:sz w:val="22"/>
+        </w:rPr>
       </w:pPr>
       <w:r>
+        <w:rPr>
+          <w:sz w:val="22"/>
+        </w:rPr>
         <w:t>The purpose of this case is to help students understand IT audit risk, internal controls, transaction processing, and audit evidence in a controlled educational environment. It is not intended to teach or encourage unauthorized automation, ticket scalping, or any activity involving real commercial systems.</w:t>
       </w:r>
     </w:p>
@@ -60,32 +78,56 @@
     <w:p>
       <w:pPr>
         <w:spacing w:after="80" w:line="240" w:lineRule="auto"/>
+        <w:rPr>
+          <w:sz w:val="22"/>
+        </w:rPr>
       </w:pPr>
       <w:r>
+        <w:rPr>
+          <w:sz w:val="22"/>
+        </w:rPr>
         <w:t>SeatGate is a sandboxed online ticketing system used by a university events office to distribute tickets for campus concerts, comedy shows, student-organization events, and selected city events. The system allows students to view upcoming events, select a ticket quantity, and submit a purchase request through a web browser. The events office uses SeatGate to manage limited ticket drops for high-demand events and to track completed purchases, remaining inventory, user activity, and exceptions.</w:t>
       </w:r>
     </w:p>
     <w:p>
       <w:pPr>
         <w:spacing w:after="80" w:line="240" w:lineRule="auto"/>
+        <w:rPr>
+          <w:sz w:val="22"/>
+        </w:rPr>
       </w:pPr>
       <w:r>
+        <w:rPr>
+          <w:sz w:val="22"/>
+        </w:rPr>
         <w:t>Management recently launched a limited online ticket drop for several high-demand events. Shortly after the release, students complained that tickets sold out almost immediately. Some users reported that they could not complete a purchase manually before the tickets disappeared. Others claimed that the website appeared to accept purchases faster than an ordinary user could reasonably click through the process. Management suspects that automated scripts may have been used to buy tickets faster than ordinary users.</w:t>
       </w:r>
     </w:p>
     <w:p>
       <w:pPr>
         <w:spacing w:after="80" w:line="240" w:lineRule="auto"/>
+        <w:rPr>
+          <w:sz w:val="22"/>
+        </w:rPr>
       </w:pPr>
       <w:r>
+        <w:rPr>
+          <w:sz w:val="22"/>
+        </w:rPr>
         <w:t>SeatGate was designed to be a controlled transaction system. Each ticket purchase should be initiated by a valid user, checked against event-level purchase limits, processed against available inventory, recorded in the transaction log, and reflected in management reports. However, management is uncertain whether these controls operated as intended during the ticket drop. In particular, management is concerned about whether the website relied too heavily on front-end restrictions that could be inspected, bypassed, or manipulated by users with basic coding knowledge.</w:t>
       </w:r>
     </w:p>
     <w:p>
       <w:pPr>
         <w:spacing w:after="80" w:line="240" w:lineRule="auto"/>
+        <w:rPr>
+          <w:sz w:val="22"/>
+        </w:rPr>
       </w:pPr>
       <w:r>
+        <w:rPr>
+          <w:sz w:val="22"/>
+        </w:rPr>
         <w:t>SeatGate’s management has engaged Rogers &amp; Rogers LLP to perform an IT audit of the ticketing system. You are a junior IT auditor on the engagement team. Your senior manager, RR Rogers, has asked you to evaluate whether SeatGate’s controls over online ticket purchases are designed and operating effectively. The engagement focuses on the system’s application controls, access controls, logging controls, and monitoring procedures during limited ticket releases.</w:t>
       </w:r>
     </w:p>
@@ -101,40 +143,70 @@
     <w:p>
       <w:pPr>
         <w:spacing w:after="80" w:line="240" w:lineRule="auto"/>
+        <w:rPr>
+          <w:sz w:val="22"/>
+        </w:rPr>
       </w:pPr>
       <w:r>
+        <w:rPr>
+          <w:sz w:val="22"/>
+        </w:rPr>
         <w:t>1. Each user may purchase no more than one ticket per event.</w:t>
       </w:r>
     </w:p>
     <w:p>
       <w:pPr>
         <w:spacing w:after="80" w:line="240" w:lineRule="auto"/>
+        <w:rPr>
+          <w:sz w:val="22"/>
+        </w:rPr>
       </w:pPr>
       <w:r>
+        <w:rPr>
+          <w:sz w:val="22"/>
+        </w:rPr>
         <w:t>2. Only valid users should be able to complete purchases.</w:t>
       </w:r>
     </w:p>
     <w:p>
       <w:pPr>
         <w:spacing w:after="80" w:line="240" w:lineRule="auto"/>
+        <w:rPr>
+          <w:sz w:val="22"/>
+        </w:rPr>
       </w:pPr>
       <w:r>
+        <w:rPr>
+          <w:sz w:val="22"/>
+        </w:rPr>
         <w:t>3. Ticket inventory should update immediately after each sale.</w:t>
       </w:r>
     </w:p>
     <w:p>
       <w:pPr>
         <w:spacing w:after="80" w:line="240" w:lineRule="auto"/>
+        <w:rPr>
+          <w:sz w:val="22"/>
+        </w:rPr>
       </w:pPr>
       <w:r>
+        <w:rPr>
+          <w:sz w:val="22"/>
+        </w:rPr>
         <w:t>4. Automated or suspicious purchasing behavior should be logged, and an exception report should be generated.</w:t>
       </w:r>
     </w:p>
     <w:p>
       <w:pPr>
         <w:spacing w:after="80" w:line="240" w:lineRule="auto"/>
+        <w:rPr>
+          <w:sz w:val="22"/>
+        </w:rPr>
       </w:pPr>
       <w:r>
+        <w:rPr>
+          <w:sz w:val="22"/>
+        </w:rPr>
         <w:t>5. Every ticket purchased should have a timestamp in the admin view.</w:t>
       </w:r>
     </w:p>
@@ -144,6 +216,7 @@
         <w:spacing w:after="80" w:line="240" w:lineRule="auto"/>
       </w:pPr>
       <w:r>
+        <w:lastRenderedPageBreak/>
         <w:t>Group Instructions and Case Flow</w:t>
       </w:r>
     </w:p>
@@ -252,7 +325,6 @@
         <w:rPr>
           <w:b/>
         </w:rPr>
-        <w:lastRenderedPageBreak/>
         <w:t xml:space="preserve">7. Backend evidence review: </w:t>
       </w:r>
       <w:r>
@@ -287,60 +359,36 @@
         <w:spacing w:after="80" w:line="240" w:lineRule="auto"/>
       </w:pPr>
       <w:r>
-        <w:t>Complete Table 1 during or immediately after the trial and main event.</w:t>
+        <w:t>Read</w:t>
       </w:r>
-    </w:p>
-    <w:p>
-      <w:pPr>
-        <w:spacing w:after="80" w:line="240" w:lineRule="auto"/>
-      </w:pPr>
       <w:r>
-        <w:t>Which event(s) did your group buy tickets for?</w:t>
+        <w:t xml:space="preserve"> Table 1 </w:t>
+      </w:r>
+      <w:r>
+        <w:t>during the trial event and complete the short process narrative.</w:t>
       </w:r>
     </w:p>
     <w:tbl>
       <w:tblPr>
         <w:tblStyle w:val="TableGrid"/>
         <w:tblW w:w="0" w:type="auto"/>
+        <w:jc w:val="center"/>
         <w:tblLook w:val="04A0" w:firstRow="1" w:lastRow="0" w:firstColumn="1" w:lastColumn="0" w:noHBand="0" w:noVBand="1"/>
       </w:tblPr>
       <w:tblGrid>
         <w:gridCol w:w="1565"/>
-        <w:gridCol w:w="2128"/>
         <w:gridCol w:w="2340"/>
         <w:gridCol w:w="2557"/>
-        <w:gridCol w:w="1640"/>
-        <w:gridCol w:w="354"/>
+        <w:gridCol w:w="1994"/>
       </w:tblGrid>
       <w:tr>
-        <w:trPr>
-          <w:gridAfter w:val="1"/>
-          <w:wAfter w:w="50" w:type="dxa"/>
-          <w:trHeight w:val="648"/>
-        </w:trPr>
-        <w:tc>
-          <w:tcPr>
-            <w:tcW w:w="10368" w:type="dxa"/>
-            <w:gridSpan w:val="5"/>
-          </w:tcPr>
-          <w:p>
-            <w:r>
-              <w:br/>
-            </w:r>
-          </w:p>
-        </w:tc>
-      </w:tr>
-      <w:tr>
-        <w:tblPrEx>
-          <w:jc w:val="center"/>
-        </w:tblPrEx>
         <w:trPr>
           <w:tblHeader/>
           <w:jc w:val="center"/>
         </w:trPr>
         <w:tc>
           <w:tcPr>
-            <w:tcW w:w="1584" w:type="dxa"/>
+            <w:tcW w:w="1565" w:type="dxa"/>
             <w:shd w:val="clear" w:color="auto" w:fill="D9D9D9"/>
             <w:tcMar>
               <w:top w:w="70" w:type="dxa"/>
@@ -362,7 +410,7 @@
         </w:tc>
         <w:tc>
           <w:tcPr>
-            <w:tcW w:w="2160" w:type="dxa"/>
+            <w:tcW w:w="2340" w:type="dxa"/>
             <w:shd w:val="clear" w:color="auto" w:fill="D9D9D9"/>
             <w:tcMar>
               <w:top w:w="70" w:type="dxa"/>
@@ -378,13 +426,13 @@
                 <w:b/>
                 <w:sz w:val="16"/>
               </w:rPr>
-              <w:t>What Your Group Observed on the Page</w:t>
+              <w:t>What the Page Element Does</w:t>
             </w:r>
           </w:p>
         </w:tc>
         <w:tc>
           <w:tcPr>
-            <w:tcW w:w="2376" w:type="dxa"/>
+            <w:tcW w:w="2557" w:type="dxa"/>
             <w:shd w:val="clear" w:color="auto" w:fill="D9D9D9"/>
             <w:tcMar>
               <w:top w:w="70" w:type="dxa"/>
@@ -400,13 +448,13 @@
                 <w:b/>
                 <w:sz w:val="16"/>
               </w:rPr>
-              <w:t>What the Page Element Does</w:t>
+              <w:t>Possible Internal-Control Issue</w:t>
             </w:r>
           </w:p>
         </w:tc>
         <w:tc>
           <w:tcPr>
-            <w:tcW w:w="2592" w:type="dxa"/>
+            <w:tcW w:w="1994" w:type="dxa"/>
             <w:shd w:val="clear" w:color="auto" w:fill="D9D9D9"/>
             <w:tcMar>
               <w:top w:w="70" w:type="dxa"/>
@@ -422,44 +470,18 @@
                 <w:b/>
                 <w:sz w:val="16"/>
               </w:rPr>
-              <w:t>Possible Internal-Control Issue</w:t>
-            </w:r>
-          </w:p>
-        </w:tc>
-        <w:tc>
-          <w:tcPr>
-            <w:tcW w:w="2016" w:type="dxa"/>
-            <w:gridSpan w:val="2"/>
-            <w:shd w:val="clear" w:color="auto" w:fill="D9D9D9"/>
-            <w:tcMar>
-              <w:top w:w="70" w:type="dxa"/>
-              <w:left w:w="60" w:type="dxa"/>
-              <w:bottom w:w="70" w:type="dxa"/>
-              <w:right w:w="60" w:type="dxa"/>
-            </w:tcMar>
-            <w:vAlign w:val="center"/>
-          </w:tcPr>
-          <w:p>
-            <w:r>
-              <w:rPr>
-                <w:b/>
-                <w:sz w:val="16"/>
-              </w:rPr>
               <w:t>Audit Relevance</w:t>
             </w:r>
           </w:p>
         </w:tc>
       </w:tr>
       <w:tr>
-        <w:tblPrEx>
-          <w:jc w:val="center"/>
-        </w:tblPrEx>
         <w:trPr>
           <w:jc w:val="center"/>
         </w:trPr>
         <w:tc>
           <w:tcPr>
-            <w:tcW w:w="1584" w:type="dxa"/>
+            <w:tcW w:w="1565" w:type="dxa"/>
             <w:tcMar>
               <w:top w:w="70" w:type="dxa"/>
               <w:left w:w="60" w:type="dxa"/>
@@ -478,19 +500,7 @@
         </w:tc>
         <w:tc>
           <w:tcPr>
-            <w:tcW w:w="2160" w:type="dxa"/>
-            <w:tcMar>
-              <w:top w:w="70" w:type="dxa"/>
-              <w:left w:w="60" w:type="dxa"/>
-              <w:bottom w:w="70" w:type="dxa"/>
-              <w:right w:w="60" w:type="dxa"/>
-            </w:tcMar>
-          </w:tcPr>
-          <w:p/>
-        </w:tc>
-        <w:tc>
-          <w:tcPr>
-            <w:tcW w:w="2376" w:type="dxa"/>
+            <w:tcW w:w="2340" w:type="dxa"/>
             <w:tcMar>
               <w:top w:w="70" w:type="dxa"/>
               <w:left w:w="60" w:type="dxa"/>
@@ -509,7 +519,7 @@
         </w:tc>
         <w:tc>
           <w:tcPr>
-            <w:tcW w:w="2592" w:type="dxa"/>
+            <w:tcW w:w="2557" w:type="dxa"/>
             <w:tcMar>
               <w:top w:w="70" w:type="dxa"/>
               <w:left w:w="60" w:type="dxa"/>
@@ -528,8 +538,7 @@
         </w:tc>
         <w:tc>
           <w:tcPr>
-            <w:tcW w:w="2016" w:type="dxa"/>
-            <w:gridSpan w:val="2"/>
+            <w:tcW w:w="1994" w:type="dxa"/>
             <w:tcMar>
               <w:top w:w="70" w:type="dxa"/>
               <w:left w:w="60" w:type="dxa"/>
@@ -548,15 +557,12 @@
         </w:tc>
       </w:tr>
       <w:tr>
-        <w:tblPrEx>
-          <w:jc w:val="center"/>
-        </w:tblPrEx>
         <w:trPr>
           <w:jc w:val="center"/>
         </w:trPr>
         <w:tc>
           <w:tcPr>
-            <w:tcW w:w="1584" w:type="dxa"/>
+            <w:tcW w:w="1565" w:type="dxa"/>
             <w:tcMar>
               <w:top w:w="70" w:type="dxa"/>
               <w:left w:w="60" w:type="dxa"/>
@@ -575,19 +581,7 @@
         </w:tc>
         <w:tc>
           <w:tcPr>
-            <w:tcW w:w="2160" w:type="dxa"/>
-            <w:tcMar>
-              <w:top w:w="70" w:type="dxa"/>
-              <w:left w:w="60" w:type="dxa"/>
-              <w:bottom w:w="70" w:type="dxa"/>
-              <w:right w:w="60" w:type="dxa"/>
-            </w:tcMar>
-          </w:tcPr>
-          <w:p/>
-        </w:tc>
-        <w:tc>
-          <w:tcPr>
-            <w:tcW w:w="2376" w:type="dxa"/>
+            <w:tcW w:w="2340" w:type="dxa"/>
             <w:tcMar>
               <w:top w:w="70" w:type="dxa"/>
               <w:left w:w="60" w:type="dxa"/>
@@ -606,7 +600,7 @@
         </w:tc>
         <w:tc>
           <w:tcPr>
-            <w:tcW w:w="2592" w:type="dxa"/>
+            <w:tcW w:w="2557" w:type="dxa"/>
             <w:tcMar>
               <w:top w:w="70" w:type="dxa"/>
               <w:left w:w="60" w:type="dxa"/>
@@ -625,8 +619,7 @@
         </w:tc>
         <w:tc>
           <w:tcPr>
-            <w:tcW w:w="2016" w:type="dxa"/>
-            <w:gridSpan w:val="2"/>
+            <w:tcW w:w="1994" w:type="dxa"/>
             <w:tcMar>
               <w:top w:w="70" w:type="dxa"/>
               <w:left w:w="60" w:type="dxa"/>
@@ -645,15 +638,12 @@
         </w:tc>
       </w:tr>
       <w:tr>
-        <w:tblPrEx>
-          <w:jc w:val="center"/>
-        </w:tblPrEx>
         <w:trPr>
           <w:jc w:val="center"/>
         </w:trPr>
         <w:tc>
           <w:tcPr>
-            <w:tcW w:w="1584" w:type="dxa"/>
+            <w:tcW w:w="1565" w:type="dxa"/>
             <w:tcMar>
               <w:top w:w="70" w:type="dxa"/>
               <w:left w:w="60" w:type="dxa"/>
@@ -672,19 +662,7 @@
         </w:tc>
         <w:tc>
           <w:tcPr>
-            <w:tcW w:w="2160" w:type="dxa"/>
-            <w:tcMar>
-              <w:top w:w="70" w:type="dxa"/>
-              <w:left w:w="60" w:type="dxa"/>
-              <w:bottom w:w="70" w:type="dxa"/>
-              <w:right w:w="60" w:type="dxa"/>
-            </w:tcMar>
-          </w:tcPr>
-          <w:p/>
-        </w:tc>
-        <w:tc>
-          <w:tcPr>
-            <w:tcW w:w="2376" w:type="dxa"/>
+            <w:tcW w:w="2340" w:type="dxa"/>
             <w:tcMar>
               <w:top w:w="70" w:type="dxa"/>
               <w:left w:w="60" w:type="dxa"/>
@@ -703,7 +681,7 @@
         </w:tc>
         <w:tc>
           <w:tcPr>
-            <w:tcW w:w="2592" w:type="dxa"/>
+            <w:tcW w:w="2557" w:type="dxa"/>
             <w:tcMar>
               <w:top w:w="70" w:type="dxa"/>
               <w:left w:w="60" w:type="dxa"/>
@@ -722,8 +700,7 @@
         </w:tc>
         <w:tc>
           <w:tcPr>
-            <w:tcW w:w="2016" w:type="dxa"/>
-            <w:gridSpan w:val="2"/>
+            <w:tcW w:w="1994" w:type="dxa"/>
             <w:tcMar>
               <w:top w:w="70" w:type="dxa"/>
               <w:left w:w="60" w:type="dxa"/>
@@ -742,15 +719,12 @@
         </w:tc>
       </w:tr>
       <w:tr>
-        <w:tblPrEx>
-          <w:jc w:val="center"/>
-        </w:tblPrEx>
         <w:trPr>
           <w:jc w:val="center"/>
         </w:trPr>
         <w:tc>
           <w:tcPr>
-            <w:tcW w:w="1584" w:type="dxa"/>
+            <w:tcW w:w="1565" w:type="dxa"/>
             <w:tcMar>
               <w:top w:w="70" w:type="dxa"/>
               <w:left w:w="60" w:type="dxa"/>
@@ -769,19 +743,7 @@
         </w:tc>
         <w:tc>
           <w:tcPr>
-            <w:tcW w:w="2160" w:type="dxa"/>
-            <w:tcMar>
-              <w:top w:w="70" w:type="dxa"/>
-              <w:left w:w="60" w:type="dxa"/>
-              <w:bottom w:w="70" w:type="dxa"/>
-              <w:right w:w="60" w:type="dxa"/>
-            </w:tcMar>
-          </w:tcPr>
-          <w:p/>
-        </w:tc>
-        <w:tc>
-          <w:tcPr>
-            <w:tcW w:w="2376" w:type="dxa"/>
+            <w:tcW w:w="2340" w:type="dxa"/>
             <w:tcMar>
               <w:top w:w="70" w:type="dxa"/>
               <w:left w:w="60" w:type="dxa"/>
@@ -800,7 +762,7 @@
         </w:tc>
         <w:tc>
           <w:tcPr>
-            <w:tcW w:w="2592" w:type="dxa"/>
+            <w:tcW w:w="2557" w:type="dxa"/>
             <w:tcMar>
               <w:top w:w="70" w:type="dxa"/>
               <w:left w:w="60" w:type="dxa"/>
@@ -819,8 +781,7 @@
         </w:tc>
         <w:tc>
           <w:tcPr>
-            <w:tcW w:w="2016" w:type="dxa"/>
-            <w:gridSpan w:val="2"/>
+            <w:tcW w:w="1994" w:type="dxa"/>
             <w:tcMar>
               <w:top w:w="70" w:type="dxa"/>
               <w:left w:w="60" w:type="dxa"/>
@@ -1057,6 +1018,7 @@
               <w:rPr>
                 <w:sz w:val="17"/>
               </w:rPr>
+              <w:lastRenderedPageBreak/>
               <w:t>Did the system block or limit the automated behavior?</w:t>
             </w:r>
           </w:p>
@@ -1114,7 +1076,6 @@
         <w:spacing w:after="80" w:line="240" w:lineRule="auto"/>
       </w:pPr>
       <w:r>
-        <w:lastRenderedPageBreak/>
         <w:t>Table 3: Group Work: Internal-Control Review</w:t>
       </w:r>
     </w:p>
@@ -1630,90 +1591,77 @@
     </w:tbl>
     <w:p>
       <w:pPr>
-        <w:pStyle w:val="Heading1"/>
         <w:spacing w:after="80" w:line="240" w:lineRule="auto"/>
       </w:pPr>
+    </w:p>
+    <w:p>
+      <w:pPr>
+        <w:spacing w:after="80" w:line="240" w:lineRule="auto"/>
+      </w:pPr>
+    </w:p>
+    <w:p>
+      <w:pPr>
+        <w:spacing w:after="80" w:line="240" w:lineRule="auto"/>
+      </w:pPr>
       <w:r>
-        <w:t>Class Discussion Questions</w:t>
+        <w:t>Links for students to watch to understand the case:</w:t>
       </w:r>
     </w:p>
     <w:p>
       <w:pPr>
         <w:spacing w:after="80" w:line="240" w:lineRule="auto"/>
       </w:pPr>
+    </w:p>
+    <w:p>
+      <w:pPr>
+        <w:spacing w:after="80" w:line="240" w:lineRule="auto"/>
+      </w:pPr>
       <w:r>
-        <w:t>1. What was the most important internal-control weakness revealed by the ticket-drop exercise?</w:t>
+        <w:t xml:space="preserve">The case: </w:t>
+      </w:r>
+      <w:hyperlink r:id="rId8" w:history="1">
+        <w:r>
+          <w:rPr>
+            <w:rStyle w:val="Hyperlink"/>
+          </w:rPr>
+          <w:t>https://youtu.be/hIh2D8scudc</w:t>
+        </w:r>
+      </w:hyperlink>
+    </w:p>
+    <w:p>
+      <w:pPr>
+        <w:spacing w:after="80" w:line="240" w:lineRule="auto"/>
+      </w:pPr>
+    </w:p>
+    <w:p>
+      <w:pPr>
+        <w:spacing w:after="80" w:line="240" w:lineRule="auto"/>
+      </w:pPr>
+      <w:r>
+        <w:t xml:space="preserve">How to view network requests: </w:t>
+      </w:r>
+      <w:hyperlink r:id="rId9" w:history="1">
+        <w:r>
+          <w:rPr>
+            <w:rStyle w:val="Hyperlink"/>
+          </w:rPr>
+          <w:t>https://youtu.be/u1Z670PWvwY</w:t>
+        </w:r>
+      </w:hyperlink>
+      <w:r>
+        <w:t xml:space="preserve"> </w:t>
       </w:r>
     </w:p>
-    <w:tbl>
-      <w:tblPr>
-        <w:tblStyle w:val="TableGrid"/>
-        <w:tblW w:w="0" w:type="auto"/>
-        <w:tblLook w:val="04A0" w:firstRow="1" w:lastRow="0" w:firstColumn="1" w:lastColumn="0" w:noHBand="0" w:noVBand="1"/>
-      </w:tblPr>
-      <w:tblGrid>
-        <w:gridCol w:w="10368"/>
-      </w:tblGrid>
-      <w:tr>
-        <w:trPr>
-          <w:trHeight w:val="504"/>
-        </w:trPr>
-        <w:tc>
-          <w:tcPr>
-            <w:tcW w:w="10368" w:type="dxa"/>
-          </w:tcPr>
-          <w:p/>
-          <w:p/>
-          <w:p/>
-          <w:p/>
-          <w:p/>
-          <w:p>
-            <w:r>
-              <w:br/>
-            </w:r>
-          </w:p>
-        </w:tc>
-      </w:tr>
-    </w:tbl>
     <w:p>
       <w:pPr>
         <w:spacing w:after="80" w:line="240" w:lineRule="auto"/>
       </w:pPr>
-      <w:r>
-        <w:t>2. What evidence would an IT auditor need to determine whether management’s stated policies were actually enforced?</w:t>
-      </w:r>
     </w:p>
-    <w:tbl>
-      <w:tblPr>
-        <w:tblStyle w:val="TableGrid"/>
-        <w:tblW w:w="0" w:type="auto"/>
-        <w:tblLook w:val="04A0" w:firstRow="1" w:lastRow="0" w:firstColumn="1" w:lastColumn="0" w:noHBand="0" w:noVBand="1"/>
-      </w:tblPr>
-      <w:tblGrid>
-        <w:gridCol w:w="10368"/>
-      </w:tblGrid>
-      <w:tr>
-        <w:trPr>
-          <w:trHeight w:val="504"/>
-        </w:trPr>
-        <w:tc>
-          <w:tcPr>
-            <w:tcW w:w="10368" w:type="dxa"/>
-          </w:tcPr>
-          <w:p>
-            <w:r>
-              <w:br/>
-            </w:r>
-          </w:p>
-          <w:p/>
-          <w:p/>
-          <w:p/>
-          <w:p/>
-          <w:p/>
-          <w:p/>
-        </w:tc>
-      </w:tr>
-    </w:tbl>
+    <w:p>
+      <w:pPr>
+        <w:spacing w:after="80" w:line="240" w:lineRule="auto"/>
+      </w:pPr>
+    </w:p>
     <w:p>
       <w:pPr>
         <w:spacing w:after="80" w:line="240" w:lineRule="auto"/>
@@ -3016,10 +2964,7 @@
         </w:rPr>
       </w:pPr>
       <w:r>
-        <w:t xml:space="preserve">The most important weakness was the failure of the implemented backend control to match management's stated policy. Management states that each user may purchase only one ticket per event, but </w:t>
-      </w:r>
-      <w:r>
-        <w:t>that is not true.</w:t>
+        <w:t>The most important weakness was the failure of the implemented backend control to match management's stated policy. Management states that each user may purchase only one ticket per event, but that is not true.</w:t>
       </w:r>
     </w:p>
     <w:p>
@@ -3037,19 +2982,16 @@
         </w:rPr>
       </w:pPr>
       <w:r>
-        <w:t xml:space="preserve">The auditor </w:t>
-      </w:r>
-      <w:r>
-        <w:t>can use a test account to check that each policy is working as it is stated. It should also check that the recorded data maps to the financial statements properly.</w:t>
+        <w:t>The auditor can use a test account to check that each policy is working as it is stated. It should also check that the recorded data maps to the financial statements properly.</w:t>
       </w:r>
     </w:p>
     <w:sectPr>
-      <w:headerReference w:type="even" r:id="rId8"/>
-      <w:headerReference w:type="default" r:id="rId9"/>
-      <w:footerReference w:type="even" r:id="rId10"/>
-      <w:footerReference w:type="default" r:id="rId11"/>
-      <w:headerReference w:type="first" r:id="rId12"/>
-      <w:footerReference w:type="first" r:id="rId13"/>
+      <w:headerReference w:type="even" r:id="rId10"/>
+      <w:headerReference w:type="default" r:id="rId11"/>
+      <w:footerReference w:type="even" r:id="rId12"/>
+      <w:footerReference w:type="default" r:id="rId13"/>
+      <w:headerReference w:type="first" r:id="rId14"/>
+      <w:footerReference w:type="first" r:id="rId15"/>
       <w:pgSz w:w="12240" w:h="15840"/>
       <w:pgMar w:top="864" w:right="936" w:bottom="864" w:left="936" w:header="720" w:footer="720" w:gutter="0"/>
       <w:cols w:space="720"/>
@@ -14886,6 +14828,29 @@
       <w:szCs w:val="20"/>
     </w:rPr>
   </w:style>
+  <w:style w:type="character" w:styleId="Hyperlink">
+    <w:name w:val="Hyperlink"/>
+    <w:basedOn w:val="DefaultParagraphFont"/>
+    <w:uiPriority w:val="99"/>
+    <w:unhideWhenUsed/>
+    <w:rsid w:val="00785B4E"/>
+    <w:rPr>
+      <w:color w:val="0000FF" w:themeColor="hyperlink"/>
+      <w:u w:val="single"/>
+    </w:rPr>
+  </w:style>
+  <w:style w:type="character" w:styleId="UnresolvedMention">
+    <w:name w:val="Unresolved Mention"/>
+    <w:basedOn w:val="DefaultParagraphFont"/>
+    <w:uiPriority w:val="99"/>
+    <w:semiHidden/>
+    <w:unhideWhenUsed/>
+    <w:rsid w:val="00785B4E"/>
+    <w:rPr>
+      <w:color w:val="605E5C"/>
+      <w:shd w:val="clear" w:color="auto" w:fill="E1DFDD"/>
+    </w:rPr>
+  </w:style>
 </w:styles>
 </file>
 

</xml_diff>